<commit_message>
docs: thêm MSSV và lớp vào tiêu đề báo cáo
Claude-Session: https://claude.ai/code/session_01ASZjA4Y7s4b33znFCVTyFH
</commit_message>
<xml_diff>
--- a/docs/bao-cao/bao-cao-phan-tich-cn019.docx
+++ b/docs/bao-cao/bao-cao-phan-tich-cn019.docx
@@ -41,7 +41,21 @@
           <w:i w:val="0"/>
           <w:sz w:val="19"/>
         </w:rPr>
-        <w:t>Sinh viên: Nguyễn Minh Hoàng · Ngành Công nghệ Thông tin · GVHD: ThS. Dương Văn Đeo · Ngày lập: 21/10/2026</w:t>
+        <w:t>Sinh viên: Nguyễn Minh Hoàng · MSSV: DH52300605 · Lớp: D23_TH08 · Ngành Công nghệ Thông tin</w:t>
+      </w:r>
+    </w:p>
+    <w:p>
+      <w:pPr>
+        <w:spacing w:after="20"/>
+        <w:jc w:val="center"/>
+      </w:pPr>
+      <w:r>
+        <w:rPr>
+          <w:b w:val="0"/>
+          <w:i w:val="0"/>
+          <w:sz w:val="19"/>
+        </w:rPr>
+        <w:t>GVHD: ThS. Dương Văn Đeo · Ngày lập: 21/10/2026</w:t>
       </w:r>
     </w:p>
     <w:p>

</xml_diff>